<commit_message>
LF1: audit fixes (degree 4, two-root and fraction average rates, negative improper slopes, vertical table, steep negative graph slope, split-form note, summary examples, speak lines); doc tool keeps parentheses on a root numerator; audit md, README row
Co-Authored-By: Claude Opus 5.5 <noreply@anthropic.com>
Claude-Session: https://claude.ai/code/session_013Y8PfETWcMLvmUEpCdE8Wq
</commit_message>
<xml_diff>
--- a/support-materials/LF1/LF1_worked_examples.docx
+++ b/support-materials/LF1/LF1_worked_examples.docx
@@ -363,17 +363,27 @@
         <w:t xml:space="preserve">−7</w:t>
       </w:r>
       <w:r>
-        <w:t xml:space="preserve"> subtracts </w:t>
-      </w:r>
-      <w:r>
-        <w:rPr>
-          <w:i/>
-          <w:iCs/>
-        </w:rPr>
-        <w:t xml:space="preserve">f(4)−f(1)</w:t>
-      </w:r>
-      <w:r>
-        <w:t xml:space="preserve"> backwards on top only. </w:t>
+        <w:t xml:space="preserve"> uses </w:t>
+      </w:r>
+      <w:r>
+        <w:rPr>
+          <w:i/>
+          <w:iCs/>
+        </w:rPr>
+        <w:t xml:space="preserve">f(1)−f(4)</w:t>
+      </w:r>
+      <w:r>
+        <w:t xml:space="preserve"> on top but </w:t>
+      </w:r>
+      <w:r>
+        <w:rPr>
+          <w:i/>
+          <w:iCs/>
+        </w:rPr>
+        <w:t xml:space="preserve">4−1</w:t>
+      </w:r>
+      <w:r>
+        <w:t xml:space="preserve"> on the bottom. </w:t>
       </w:r>
       <w:r>
         <w:rPr>
@@ -404,7 +414,7 @@
           <w:sz w:val="40"/>
           <w:szCs w:val="40"/>
         </w:rPr>
-        <w:t xml:space="preserve">f(x)=−x</w:t>
+        <w:t xml:space="preserve">f(x)=x</w:t>
       </w:r>
       <w:r>
         <w:rPr>
@@ -414,7 +424,7 @@
           <w:szCs w:val="40"/>
           <w:vertAlign w:val="superscript"/>
         </w:rPr>
-        <w:t xml:space="preserve">3</w:t>
+        <w:t xml:space="preserve">4</w:t>
       </w:r>
       <w:r>
         <w:rPr>
@@ -423,7 +433,7 @@
           <w:sz w:val="40"/>
           <w:szCs w:val="40"/>
         </w:rPr>
-        <w:t xml:space="preserve">+4x  on  [−2,1]</w:t>
+        <w:t xml:space="preserve">−2x  on  [−2,1]</w:t>
       </w:r>
     </w:p>
     <w:p>
@@ -460,7 +470,7 @@
           <w:i/>
           <w:iCs/>
         </w:rPr>
-        <w:t xml:space="preserve">1</w:t>
+        <w:t xml:space="preserve">−7</w:t>
       </w:r>
     </w:p>
     <w:p>
@@ -480,7 +490,7 @@
           <w:i/>
           <w:iCs/>
         </w:rPr>
-        <w:t xml:space="preserve">−3</w:t>
+        <w:t xml:space="preserve">−21</w:t>
       </w:r>
     </w:p>
     <w:p>
@@ -500,7 +510,7 @@
           <w:i/>
           <w:iCs/>
         </w:rPr>
-        <w:t xml:space="preserve">19/3</w:t>
+        <w:t xml:space="preserve">11/3</w:t>
       </w:r>
     </w:p>
     <w:p>
@@ -520,7 +530,7 @@
           <w:i/>
           <w:iCs/>
         </w:rPr>
-        <w:t xml:space="preserve">3</w:t>
+        <w:t xml:space="preserve">7</w:t>
       </w:r>
     </w:p>
     <w:p>
@@ -541,7 +551,7 @@
           <w:i/>
           <w:iCs/>
         </w:rPr>
-        <w:t xml:space="preserve">f(1)=−1+4=3</w:t>
+        <w:t xml:space="preserve">f(1)=1−2=−1</w:t>
       </w:r>
       <w:r>
         <w:t xml:space="preserve">. At the negative end, </w:t>
@@ -559,14 +569,14 @@
           <w:iCs/>
           <w:vertAlign w:val="superscript"/>
         </w:rPr>
-        <w:t xml:space="preserve">3</w:t>
-      </w:r>
-      <w:r>
-        <w:rPr>
-          <w:i/>
-          <w:iCs/>
-        </w:rPr>
-        <w:t xml:space="preserve">=−8</w:t>
+        <w:t xml:space="preserve">4</w:t>
+      </w:r>
+      <w:r>
+        <w:rPr>
+          <w:i/>
+          <w:iCs/>
+        </w:rPr>
+        <w:t xml:space="preserve">=16</w:t>
       </w:r>
       <w:r>
         <w:t xml:space="preserve">, so </w:t>
@@ -576,7 +586,7 @@
           <w:i/>
           <w:iCs/>
         </w:rPr>
-        <w:t xml:space="preserve">f(−2)=−(−8)+4(−2)=8−8=0</w:t>
+        <w:t xml:space="preserve">f(−2)=16−2(−2)=16+4=20</w:t>
       </w:r>
       <w:r>
         <w:t xml:space="preserve">. The change in input is </w:t>
@@ -596,7 +606,7 @@
           <w:i/>
           <w:iCs/>
         </w:rPr>
-        <w:t xml:space="preserve">(3−0)/3=1</w:t>
+        <w:t xml:space="preserve">(−1−20)/3=(−21)/3=−7</w:t>
       </w:r>
       <w:r>
         <w:t xml:space="preserve">. </w:t>
@@ -606,17 +616,35 @@
           <w:i/>
           <w:iCs/>
         </w:rPr>
-        <w:t xml:space="preserve">−3</w:t>
-      </w:r>
-      <w:r>
-        <w:t xml:space="preserve"> works out </w:t>
-      </w:r>
-      <w:r>
-        <w:rPr>
-          <w:i/>
-          <w:iCs/>
-        </w:rPr>
-        <w:t xml:space="preserve">1−(−2)</w:t>
+        <w:t xml:space="preserve">−21</w:t>
+      </w:r>
+      <w:r>
+        <w:t xml:space="preserve"> stops before dividing by the change in input; 7 subtracts the outputs in the other order on top only; and </w:t>
+      </w:r>
+      <w:r>
+        <w:rPr>
+          <w:i/>
+          <w:iCs/>
+        </w:rPr>
+        <w:t xml:space="preserve">11/3</w:t>
+      </w:r>
+      <w:r>
+        <w:t xml:space="preserve"> takes </w:t>
+      </w:r>
+      <w:r>
+        <w:rPr>
+          <w:i/>
+          <w:iCs/>
+        </w:rPr>
+        <w:t xml:space="preserve">(−2)</w:t>
+      </w:r>
+      <w:r>
+        <w:rPr>
+          <w:i/>
+          <w:iCs/>
+          <w:vertAlign w:val="superscript"/>
+        </w:rPr>
+        <w:t xml:space="preserve">4</w:t>
       </w:r>
       <w:r>
         <w:t xml:space="preserve"> as </w:t>
@@ -626,42 +654,7 @@
           <w:i/>
           <w:iCs/>
         </w:rPr>
-        <w:t xml:space="preserve">−1</w:t>
-      </w:r>
-      <w:r>
-        <w:t xml:space="preserve">; </w:t>
-      </w:r>
-      <w:r>
-        <w:rPr>
-          <w:i/>
-          <w:iCs/>
-        </w:rPr>
-        <w:t xml:space="preserve">19/3</w:t>
-      </w:r>
-      <w:r>
-        <w:t xml:space="preserve"> uses </w:t>
-      </w:r>
-      <w:r>
-        <w:rPr>
-          <w:i/>
-          <w:iCs/>
-        </w:rPr>
-        <w:t xml:space="preserve">(−2)</w:t>
-      </w:r>
-      <w:r>
-        <w:rPr>
-          <w:i/>
-          <w:iCs/>
-          <w:vertAlign w:val="superscript"/>
-        </w:rPr>
-        <w:t xml:space="preserve">3</w:t>
-      </w:r>
-      <w:r>
-        <w:rPr>
-          <w:i/>
-          <w:iCs/>
-        </w:rPr>
-        <w:t xml:space="preserve">=8</w:t>
+        <w:t xml:space="preserve">−16</w:t>
       </w:r>
       <w:r>
         <w:t xml:space="preserve">, so </w:t>
@@ -681,17 +674,33 @@
           <w:i/>
           <w:iCs/>
         </w:rPr>
-        <w:t xml:space="preserve">−16</w:t>
-      </w:r>
-      <w:r>
-        <w:t xml:space="preserve">; and 3 stops before dividing by the change in input. </w:t>
-      </w:r>
-      <w:r>
-        <w:rPr>
-          <w:b/>
-          <w:bCs/>
-        </w:rPr>
-        <w:t xml:space="preserve">The average rate of change is 1.</w:t>
+        <w:t xml:space="preserve">−12</w:t>
+      </w:r>
+      <w:r>
+        <w:t xml:space="preserve">. </w:t>
+      </w:r>
+      <w:r>
+        <w:rPr>
+          <w:b/>
+          <w:bCs/>
+        </w:rPr>
+        <w:t xml:space="preserve">The average rate of change is </w:t>
+      </w:r>
+      <w:r>
+        <w:rPr>
+          <w:b/>
+          <w:bCs/>
+          <w:i/>
+          <w:iCs/>
+        </w:rPr>
+        <w:t xml:space="preserve">−7</w:t>
+      </w:r>
+      <w:r>
+        <w:rPr>
+          <w:b/>
+          <w:bCs/>
+        </w:rPr>
+        <w:t xml:space="preserve">.</w:t>
       </w:r>
     </w:p>
     <w:p>
@@ -715,7 +724,7 @@
           <w:sz w:val="40"/>
           <w:szCs w:val="40"/>
         </w:rPr>
-        <w:t xml:space="preserve">f(x)=√(2x+1)  on  [4,10]</w:t>
+        <w:t xml:space="preserve">f(x)=√(3x+2)  on  [1,3]</w:t>
       </w:r>
     </w:p>
     <w:p>
@@ -732,7 +741,7 @@
         <w:spacing w:after="120" w:before="80" w:line="300"/>
       </w:pPr>
       <w:r>
-        <w:t xml:space="preserve">What is the average rate of change of f on [4, 10]?</w:t>
+        <w:t xml:space="preserve">What is the average rate of change of f on [1, 3]?</w:t>
       </w:r>
     </w:p>
     <w:p>
@@ -752,7 +761,7 @@
           <w:i/>
           <w:iCs/>
         </w:rPr>
-        <w:t xml:space="preserve">(√21−3)/6</w:t>
+        <w:t xml:space="preserve">(√11−√5)/2</w:t>
       </w:r>
     </w:p>
     <w:p>
@@ -772,7 +781,7 @@
           <w:i/>
           <w:iCs/>
         </w:rPr>
-        <w:t xml:space="preserve">√12/6</w:t>
+        <w:t xml:space="preserve">(√6)/2</w:t>
       </w:r>
     </w:p>
     <w:p>
@@ -792,7 +801,7 @@
           <w:i/>
           <w:iCs/>
         </w:rPr>
-        <w:t xml:space="preserve">2</w:t>
+        <w:t xml:space="preserve">3</w:t>
       </w:r>
     </w:p>
     <w:p>
@@ -812,7 +821,7 @@
           <w:i/>
           <w:iCs/>
         </w:rPr>
-        <w:t xml:space="preserve">(√21+3)/6</w:t>
+        <w:t xml:space="preserve">(√11+√5)/2</w:t>
       </w:r>
     </w:p>
     <w:p>
@@ -833,37 +842,47 @@
           <w:i/>
           <w:iCs/>
         </w:rPr>
-        <w:t xml:space="preserve">f(10)=√21</w:t>
-      </w:r>
-      <w:r>
-        <w:t xml:space="preserve">, which does not simplify, and </w:t>
-      </w:r>
-      <w:r>
-        <w:rPr>
-          <w:i/>
-          <w:iCs/>
-        </w:rPr>
-        <w:t xml:space="preserve">f(4)=√9=3</w:t>
-      </w:r>
-      <w:r>
-        <w:t xml:space="preserve">. So the average rate of change is </w:t>
-      </w:r>
-      <w:r>
-        <w:rPr>
-          <w:i/>
-          <w:iCs/>
-        </w:rPr>
-        <w:t xml:space="preserve">(√21−3)/(10−4)=(√21−3)/6</w:t>
-      </w:r>
-      <w:r>
-        <w:t xml:space="preserve">, an exact answer to leave as it is. </w:t>
-      </w:r>
-      <w:r>
-        <w:rPr>
-          <w:i/>
-          <w:iCs/>
-        </w:rPr>
-        <w:t xml:space="preserve">√12/6</w:t>
+        <w:t xml:space="preserve">f(3)=√11</w:t>
+      </w:r>
+      <w:r>
+        <w:t xml:space="preserve"> and </w:t>
+      </w:r>
+      <w:r>
+        <w:rPr>
+          <w:i/>
+          <w:iCs/>
+        </w:rPr>
+        <w:t xml:space="preserve">f(1)=√5</w:t>
+      </w:r>
+      <w:r>
+        <w:t xml:space="preserve">; neither simplifies. So the average rate of change is </w:t>
+      </w:r>
+      <w:r>
+        <w:rPr>
+          <w:i/>
+          <w:iCs/>
+        </w:rPr>
+        <w:t xml:space="preserve">(√11−√5)/(3−1)=(√11−√5)/2</w:t>
+      </w:r>
+      <w:r>
+        <w:t xml:space="preserve">, an exact answer to leave as it is. CheckIt may print it split up, as </w:t>
+      </w:r>
+      <w:r>
+        <w:rPr>
+          <w:i/>
+          <w:iCs/>
+        </w:rPr>
+        <w:t xml:space="preserve">1/2√11−1/2√5</w:t>
+      </w:r>
+      <w:r>
+        <w:t xml:space="preserve">, which is the same number. </w:t>
+      </w:r>
+      <w:r>
+        <w:rPr>
+          <w:i/>
+          <w:iCs/>
+        </w:rPr>
+        <w:t xml:space="preserve">(√6)/2</w:t>
       </w:r>
       <w:r>
         <w:t xml:space="preserve"> combines </w:t>
@@ -873,7 +892,7 @@
           <w:i/>
           <w:iCs/>
         </w:rPr>
-        <w:t xml:space="preserve">√21−√9</w:t>
+        <w:t xml:space="preserve">√11−√5</w:t>
       </w:r>
       <w:r>
         <w:t xml:space="preserve"> into </w:t>
@@ -883,17 +902,17 @@
           <w:i/>
           <w:iCs/>
         </w:rPr>
-        <w:t xml:space="preserve">√(21−9)</w:t>
-      </w:r>
-      <w:r>
-        <w:t xml:space="preserve">, which is not allowed; 2 subtracts the numbers under the roots, </w:t>
-      </w:r>
-      <w:r>
-        <w:rPr>
-          <w:i/>
-          <w:iCs/>
-        </w:rPr>
-        <w:t xml:space="preserve">(21−9)/6</w:t>
+        <w:t xml:space="preserve">√(11−5)</w:t>
+      </w:r>
+      <w:r>
+        <w:t xml:space="preserve">, which is not allowed; 3 subtracts the numbers under the roots, </w:t>
+      </w:r>
+      <w:r>
+        <w:rPr>
+          <w:i/>
+          <w:iCs/>
+        </w:rPr>
+        <w:t xml:space="preserve">(11−5)/2</w:t>
       </w:r>
       <w:r>
         <w:t xml:space="preserve">, and drops the roots; and </w:t>
@@ -903,7 +922,7 @@
           <w:i/>
           <w:iCs/>
         </w:rPr>
-        <w:t xml:space="preserve">+3</w:t>
+        <w:t xml:space="preserve">+</w:t>
       </w:r>
       <w:r>
         <w:t xml:space="preserve"> adds the outputs instead of subtracting them. </w:t>
@@ -915,7 +934,7 @@
           <w:i/>
           <w:iCs/>
         </w:rPr>
-        <w:t xml:space="preserve">(√21−3)/6</w:t>
+        <w:t xml:space="preserve">(√11−√5)/2</w:t>
       </w:r>
       <w:r>
         <w:rPr>
@@ -946,7 +965,7 @@
           <w:sz w:val="40"/>
           <w:szCs w:val="40"/>
         </w:rPr>
-        <w:t xml:space="preserve">f(x)=(x+3)/(x−1)  on  [3,5]</w:t>
+        <w:t xml:space="preserve">f(x)=(2x−1)/(x+2)  on  [1,4]</w:t>
       </w:r>
     </w:p>
     <w:p>
@@ -963,7 +982,7 @@
         <w:spacing w:after="120" w:before="80" w:line="300"/>
       </w:pPr>
       <w:r>
-        <w:t xml:space="preserve">What is the average rate of change of f on [3, 5]?</w:t>
+        <w:t xml:space="preserve">What is the average rate of change of f on [1, 4]?</w:t>
       </w:r>
     </w:p>
     <w:p>
@@ -983,7 +1002,7 @@
           <w:i/>
           <w:iCs/>
         </w:rPr>
-        <w:t xml:space="preserve">1/2</w:t>
+        <w:t xml:space="preserve">5/6</w:t>
       </w:r>
     </w:p>
     <w:p>
@@ -1003,7 +1022,7 @@
           <w:i/>
           <w:iCs/>
         </w:rPr>
-        <w:t xml:space="preserve">−2</w:t>
+        <w:t xml:space="preserve">18/5</w:t>
       </w:r>
     </w:p>
     <w:p>
@@ -1023,7 +1042,7 @@
           <w:i/>
           <w:iCs/>
         </w:rPr>
-        <w:t xml:space="preserve">−1/2</w:t>
+        <w:t xml:space="preserve">5/18</w:t>
       </w:r>
     </w:p>
     <w:p>
@@ -1043,7 +1062,7 @@
           <w:i/>
           <w:iCs/>
         </w:rPr>
-        <w:t xml:space="preserve">−1</w:t>
+        <w:t xml:space="preserve">−5/18</w:t>
       </w:r>
     </w:p>
     <w:p>
@@ -1064,7 +1083,7 @@
           <w:i/>
           <w:iCs/>
         </w:rPr>
-        <w:t xml:space="preserve">f(5)=8/4=2</w:t>
+        <w:t xml:space="preserve">f(4)=7/6</w:t>
       </w:r>
       <w:r>
         <w:t xml:space="preserve"> and </w:t>
@@ -1074,59 +1093,69 @@
           <w:i/>
           <w:iCs/>
         </w:rPr>
-        <w:t xml:space="preserve">f(3)=6/2=3</w:t>
-      </w:r>
-      <w:r>
-        <w:t xml:space="preserve">. The output went down by 1 while the input went up by 2: </w:t>
-      </w:r>
-      <w:r>
-        <w:rPr>
-          <w:i/>
-          <w:iCs/>
-        </w:rPr>
-        <w:t xml:space="preserve">(2−3)/(5−3)=−1/2</w:t>
-      </w:r>
-      <w:r>
-        <w:t xml:space="preserve">. A falling function has a negative average rate of change. </w:t>
-      </w:r>
-      <w:r>
-        <w:rPr>
-          <w:i/>
-          <w:iCs/>
-        </w:rPr>
-        <w:t xml:space="preserve">1/2</w:t>
-      </w:r>
-      <w:r>
-        <w:t xml:space="preserve"> subtracts the outputs in the other order on top only; </w:t>
-      </w:r>
-      <w:r>
-        <w:rPr>
-          <w:i/>
-          <w:iCs/>
-        </w:rPr>
-        <w:t xml:space="preserve">−2</w:t>
-      </w:r>
-      <w:r>
-        <w:t xml:space="preserve"> divides the change in input by the change in output; and </w:t>
-      </w:r>
-      <w:r>
-        <w:rPr>
-          <w:i/>
-          <w:iCs/>
-        </w:rPr>
-        <w:t xml:space="preserve">−1</w:t>
-      </w:r>
-      <w:r>
-        <w:t xml:space="preserve"> stops before dividing by 2. </w:t>
-      </w:r>
-      <w:r>
-        <w:rPr>
-          <w:b/>
-          <w:bCs/>
-          <w:i/>
-          <w:iCs/>
-        </w:rPr>
-        <w:t xml:space="preserve">−1/2</w:t>
+        <w:t xml:space="preserve">f(1)=1/3=2/6</w:t>
+      </w:r>
+      <w:r>
+        <w:t xml:space="preserve">. The change in output is </w:t>
+      </w:r>
+      <w:r>
+        <w:rPr>
+          <w:i/>
+          <w:iCs/>
+        </w:rPr>
+        <w:t xml:space="preserve">7/6−2/6=5/6</w:t>
+      </w:r>
+      <w:r>
+        <w:t xml:space="preserve">, over a change in input of 3: </w:t>
+      </w:r>
+      <w:r>
+        <w:rPr>
+          <w:i/>
+          <w:iCs/>
+        </w:rPr>
+        <w:t xml:space="preserve">5/6÷ 3=5/18</w:t>
+      </w:r>
+      <w:r>
+        <w:t xml:space="preserve">. Fractions inside fractions are normal here; keep them exact. </w:t>
+      </w:r>
+      <w:r>
+        <w:rPr>
+          <w:i/>
+          <w:iCs/>
+        </w:rPr>
+        <w:t xml:space="preserve">5/6</w:t>
+      </w:r>
+      <w:r>
+        <w:t xml:space="preserve"> stops before dividing by 3; </w:t>
+      </w:r>
+      <w:r>
+        <w:rPr>
+          <w:i/>
+          <w:iCs/>
+        </w:rPr>
+        <w:t xml:space="preserve">18/5</w:t>
+      </w:r>
+      <w:r>
+        <w:t xml:space="preserve"> divides the other way; and </w:t>
+      </w:r>
+      <w:r>
+        <w:rPr>
+          <w:i/>
+          <w:iCs/>
+        </w:rPr>
+        <w:t xml:space="preserve">−5/18</w:t>
+      </w:r>
+      <w:r>
+        <w:t xml:space="preserve"> subtracts the outputs in the other order on top only. </w:t>
+      </w:r>
+      <w:r>
+        <w:rPr>
+          <w:b/>
+          <w:bCs/>
+          <w:i/>
+          <w:iCs/>
+        </w:rPr>
+        <w:t xml:space="preserve">5/18</w:t>
       </w:r>
       <w:r>
         <w:rPr>
@@ -1418,7 +1447,7 @@
           <w:sz w:val="40"/>
           <w:szCs w:val="40"/>
         </w:rPr>
-        <w:t xml:space="preserve">(2,−4)  and  (8,0)</w:t>
+        <w:t xml:space="preserve">(−4,6)  and  (2,−8)</w:t>
       </w:r>
     </w:p>
     <w:p>
@@ -1455,7 +1484,7 @@
           <w:i/>
           <w:iCs/>
         </w:rPr>
-        <w:t xml:space="preserve">2/3</w:t>
+        <w:t xml:space="preserve">−7/3</w:t>
       </w:r>
     </w:p>
     <w:p>
@@ -1475,7 +1504,7 @@
           <w:i/>
           <w:iCs/>
         </w:rPr>
-        <w:t xml:space="preserve">3/2</w:t>
+        <w:t xml:space="preserve">−3/7</w:t>
       </w:r>
     </w:p>
     <w:p>
@@ -1495,7 +1524,7 @@
           <w:i/>
           <w:iCs/>
         </w:rPr>
-        <w:t xml:space="preserve">−2/3</w:t>
+        <w:t xml:space="preserve">7/3</w:t>
       </w:r>
     </w:p>
     <w:p>
@@ -1515,7 +1544,7 @@
           <w:i/>
           <w:iCs/>
         </w:rPr>
-        <w:t xml:space="preserve">1/2</w:t>
+        <w:t xml:space="preserve">−7</w:t>
       </w:r>
     </w:p>
     <w:p>
@@ -1536,17 +1565,27 @@
           <w:i/>
           <w:iCs/>
         </w:rPr>
-        <w:t xml:space="preserve">(0−(−4))/(8−2)=4/6=2/3</w:t>
-      </w:r>
-      <w:r>
-        <w:t xml:space="preserve">. Reduce the fraction; CheckIt's slopes are in lowest terms. </w:t>
-      </w:r>
-      <w:r>
-        <w:rPr>
-          <w:i/>
-          <w:iCs/>
-        </w:rPr>
-        <w:t xml:space="preserve">3/2</w:t>
+        <w:t xml:space="preserve">(−8−6)/(2−(−4))=(−14)/6=−7/3</w:t>
+      </w:r>
+      <w:r>
+        <w:t xml:space="preserve">. Reduce the fraction, and leave it improper: CheckIt writes slopes like </w:t>
+      </w:r>
+      <w:r>
+        <w:rPr>
+          <w:i/>
+          <w:iCs/>
+        </w:rPr>
+        <w:t xml:space="preserve">−7/3</w:t>
+      </w:r>
+      <w:r>
+        <w:t xml:space="preserve">, not mixed numbers. </w:t>
+      </w:r>
+      <w:r>
+        <w:rPr>
+          <w:i/>
+          <w:iCs/>
+        </w:rPr>
+        <w:t xml:space="preserve">−3/7</w:t>
       </w:r>
       <w:r>
         <w:t xml:space="preserve"> puts the change in </w:t>
@@ -1566,40 +1605,20 @@
           <w:i/>
           <w:iCs/>
         </w:rPr>
-        <w:t xml:space="preserve">−2/3</w:t>
-      </w:r>
-      <w:r>
-        <w:t xml:space="preserve"> treats </w:t>
-      </w:r>
-      <w:r>
-        <w:rPr>
-          <w:i/>
-          <w:iCs/>
-        </w:rPr>
-        <w:t xml:space="preserve">0−(−4)</w:t>
-      </w:r>
-      <w:r>
-        <w:t xml:space="preserve"> as </w:t>
-      </w:r>
-      <w:r>
-        <w:rPr>
-          <w:i/>
-          <w:iCs/>
-        </w:rPr>
-        <w:t xml:space="preserve">−4</w:t>
-      </w:r>
-      <w:r>
-        <w:t xml:space="preserve">; and </w:t>
-      </w:r>
-      <w:r>
-        <w:rPr>
-          <w:i/>
-          <w:iCs/>
-        </w:rPr>
-        <w:t xml:space="preserve">1/2</w:t>
-      </w:r>
-      <w:r>
-        <w:t xml:space="preserve"> divides by 8, the second </w:t>
+        <w:t xml:space="preserve">7/3</w:t>
+      </w:r>
+      <w:r>
+        <w:t xml:space="preserve"> loses the sign, though </w:t>
+      </w:r>
+      <w:r>
+        <w:rPr>
+          <w:i/>
+          <w:iCs/>
+        </w:rPr>
+        <w:t xml:space="preserve">y</w:t>
+      </w:r>
+      <w:r>
+        <w:t xml:space="preserve"> goes down as </w:t>
       </w:r>
       <w:r>
         <w:rPr>
@@ -1609,6 +1628,26 @@
         <w:t xml:space="preserve">x</w:t>
       </w:r>
       <w:r>
+        <w:t xml:space="preserve"> goes up; and </w:t>
+      </w:r>
+      <w:r>
+        <w:rPr>
+          <w:i/>
+          <w:iCs/>
+        </w:rPr>
+        <w:t xml:space="preserve">−7</w:t>
+      </w:r>
+      <w:r>
+        <w:t xml:space="preserve"> divides by 2, the second </w:t>
+      </w:r>
+      <w:r>
+        <w:rPr>
+          <w:i/>
+          <w:iCs/>
+        </w:rPr>
+        <w:t xml:space="preserve">x</w:t>
+      </w:r>
+      <w:r>
         <w:t xml:space="preserve">-value, instead of the change in </w:t>
       </w:r>
       <w:r>
@@ -1635,7 +1674,7 @@
           <w:i/>
           <w:iCs/>
         </w:rPr>
-        <w:t xml:space="preserve">2/3</w:t>
+        <w:t xml:space="preserve">−7/3</w:t>
       </w:r>
       <w:r>
         <w:rPr>
@@ -2285,7 +2324,7 @@
         <w:t xml:space="preserve">Table 2. </w:t>
       </w:r>
       <w:r>
-        <w:t xml:space="preserve">Points on a line, listed in two rows</w:t>
+        <w:t xml:space="preserve">Points on a line, in columns</w:t>
       </w:r>
     </w:p>
     <w:tbl>
@@ -2302,10 +2341,7 @@
       </w:tblPr>
       <w:tblGrid>
         <w:gridCol w:w="1100"/>
-        <w:gridCol w:w="1975"/>
-        <w:gridCol w:w="1975"/>
-        <w:gridCol w:w="1975"/>
-        <w:gridCol w:w="1975"/>
+        <w:gridCol w:w="7900"/>
       </w:tblGrid>
       <w:tr>
         <w:tc>
@@ -2342,133 +2378,7 @@
         </w:tc>
         <w:tc>
           <w:tcPr>
-            <w:tcW w:type="dxa" w:w="1975"/>
-            <w:tcBorders>
-              <w:top w:val="single" w:color="555555" w:sz="6"/>
-              <w:left w:val="single" w:color="555555" w:sz="6"/>
-              <w:bottom w:val="single" w:color="555555" w:sz="6"/>
-              <w:right w:val="single" w:color="555555" w:sz="6"/>
-            </w:tcBorders>
-            <w:tcMar>
-              <w:top w:type="dxa" w:w="80"/>
-              <w:left w:type="dxa" w:w="120"/>
-              <w:bottom w:type="dxa" w:w="80"/>
-              <w:right w:type="dxa" w:w="120"/>
-            </w:tcMar>
-          </w:tcPr>
-          <w:p>
-            <w:pPr>
-              <w:jc w:val="center"/>
-            </w:pPr>
-            <w:r>
-              <w:rPr>
-                <w:b w:val="false"/>
-                <w:bCs w:val="false"/>
-                <w:sz w:val="28"/>
-                <w:szCs w:val="28"/>
-              </w:rPr>
-              <w:t xml:space="preserve">−8</w:t>
-            </w:r>
-          </w:p>
-        </w:tc>
-        <w:tc>
-          <w:tcPr>
-            <w:tcW w:type="dxa" w:w="1975"/>
-            <w:tcBorders>
-              <w:top w:val="single" w:color="555555" w:sz="6"/>
-              <w:left w:val="single" w:color="555555" w:sz="6"/>
-              <w:bottom w:val="single" w:color="555555" w:sz="6"/>
-              <w:right w:val="single" w:color="555555" w:sz="6"/>
-            </w:tcBorders>
-            <w:tcMar>
-              <w:top w:type="dxa" w:w="80"/>
-              <w:left w:type="dxa" w:w="120"/>
-              <w:bottom w:type="dxa" w:w="80"/>
-              <w:right w:type="dxa" w:w="120"/>
-            </w:tcMar>
-          </w:tcPr>
-          <w:p>
-            <w:pPr>
-              <w:jc w:val="center"/>
-            </w:pPr>
-            <w:r>
-              <w:rPr>
-                <w:b w:val="false"/>
-                <w:bCs w:val="false"/>
-                <w:sz w:val="28"/>
-                <w:szCs w:val="28"/>
-              </w:rPr>
-              <w:t xml:space="preserve">−4</w:t>
-            </w:r>
-          </w:p>
-        </w:tc>
-        <w:tc>
-          <w:tcPr>
-            <w:tcW w:type="dxa" w:w="1975"/>
-            <w:tcBorders>
-              <w:top w:val="single" w:color="555555" w:sz="6"/>
-              <w:left w:val="single" w:color="555555" w:sz="6"/>
-              <w:bottom w:val="single" w:color="555555" w:sz="6"/>
-              <w:right w:val="single" w:color="555555" w:sz="6"/>
-            </w:tcBorders>
-            <w:tcMar>
-              <w:top w:type="dxa" w:w="80"/>
-              <w:left w:type="dxa" w:w="120"/>
-              <w:bottom w:type="dxa" w:w="80"/>
-              <w:right w:type="dxa" w:w="120"/>
-            </w:tcMar>
-          </w:tcPr>
-          <w:p>
-            <w:pPr>
-              <w:jc w:val="center"/>
-            </w:pPr>
-            <w:r>
-              <w:rPr>
-                <w:b w:val="false"/>
-                <w:bCs w:val="false"/>
-                <w:sz w:val="28"/>
-                <w:szCs w:val="28"/>
-              </w:rPr>
-              <w:t xml:space="preserve">4</w:t>
-            </w:r>
-          </w:p>
-        </w:tc>
-        <w:tc>
-          <w:tcPr>
-            <w:tcW w:type="dxa" w:w="1975"/>
-            <w:tcBorders>
-              <w:top w:val="single" w:color="555555" w:sz="6"/>
-              <w:left w:val="single" w:color="555555" w:sz="6"/>
-              <w:bottom w:val="single" w:color="555555" w:sz="6"/>
-              <w:right w:val="single" w:color="555555" w:sz="6"/>
-            </w:tcBorders>
-            <w:tcMar>
-              <w:top w:type="dxa" w:w="80"/>
-              <w:left w:type="dxa" w:w="120"/>
-              <w:bottom w:type="dxa" w:w="80"/>
-              <w:right w:type="dxa" w:w="120"/>
-            </w:tcMar>
-          </w:tcPr>
-          <w:p>
-            <w:pPr>
-              <w:jc w:val="center"/>
-            </w:pPr>
-            <w:r>
-              <w:rPr>
-                <w:b w:val="false"/>
-                <w:bCs w:val="false"/>
-                <w:sz w:val="28"/>
-                <w:szCs w:val="28"/>
-              </w:rPr>
-              <w:t xml:space="preserve">12</w:t>
-            </w:r>
-          </w:p>
-        </w:tc>
-      </w:tr>
-      <w:tr>
-        <w:tc>
-          <w:tcPr>
-            <w:tcW w:type="dxa" w:w="1100"/>
+            <w:tcW w:type="dxa" w:w="7900"/>
             <w:tcBorders>
               <w:top w:val="single" w:color="555555" w:sz="6"/>
               <w:left w:val="single" w:color="555555" w:sz="6"/>
@@ -2498,9 +2408,11 @@
             </w:r>
           </w:p>
         </w:tc>
+      </w:tr>
+      <w:tr>
         <w:tc>
           <w:tcPr>
-            <w:tcW w:type="dxa" w:w="1975"/>
+            <w:tcW w:type="dxa" w:w="1100"/>
             <w:tcBorders>
               <w:top w:val="single" w:color="555555" w:sz="6"/>
               <w:left w:val="single" w:color="555555" w:sz="6"/>
@@ -2525,13 +2437,46 @@
                 <w:sz w:val="28"/>
                 <w:szCs w:val="28"/>
               </w:rPr>
-              <w:t xml:space="preserve">−8</w:t>
+              <w:t xml:space="preserve">−15</w:t>
             </w:r>
           </w:p>
         </w:tc>
         <w:tc>
           <w:tcPr>
-            <w:tcW w:type="dxa" w:w="1975"/>
+            <w:tcW w:type="dxa" w:w="7900"/>
+            <w:tcBorders>
+              <w:top w:val="single" w:color="555555" w:sz="6"/>
+              <w:left w:val="single" w:color="555555" w:sz="6"/>
+              <w:bottom w:val="single" w:color="555555" w:sz="6"/>
+              <w:right w:val="single" w:color="555555" w:sz="6"/>
+            </w:tcBorders>
+            <w:tcMar>
+              <w:top w:type="dxa" w:w="80"/>
+              <w:left w:type="dxa" w:w="120"/>
+              <w:bottom w:type="dxa" w:w="80"/>
+              <w:right w:type="dxa" w:w="120"/>
+            </w:tcMar>
+          </w:tcPr>
+          <w:p>
+            <w:pPr>
+              <w:jc w:val="center"/>
+            </w:pPr>
+            <w:r>
+              <w:rPr>
+                <w:b w:val="false"/>
+                <w:bCs w:val="false"/>
+                <w:sz w:val="28"/>
+                <w:szCs w:val="28"/>
+              </w:rPr>
+              <w:t xml:space="preserve">24</w:t>
+            </w:r>
+          </w:p>
+        </w:tc>
+      </w:tr>
+      <w:tr>
+        <w:tc>
+          <w:tcPr>
+            <w:tcW w:type="dxa" w:w="1100"/>
             <w:tcBorders>
               <w:top w:val="single" w:color="555555" w:sz="6"/>
               <w:left w:val="single" w:color="555555" w:sz="6"/>
@@ -2562,7 +2507,7 @@
         </w:tc>
         <w:tc>
           <w:tcPr>
-            <w:tcW w:type="dxa" w:w="1975"/>
+            <w:tcW w:type="dxa" w:w="7900"/>
             <w:tcBorders>
               <w:top w:val="single" w:color="555555" w:sz="6"/>
               <w:left w:val="single" w:color="555555" w:sz="6"/>
@@ -2587,13 +2532,15 @@
                 <w:sz w:val="28"/>
                 <w:szCs w:val="28"/>
               </w:rPr>
-              <w:t xml:space="preserve">1</w:t>
+              <w:t xml:space="preserve">10</w:t>
             </w:r>
           </w:p>
         </w:tc>
+      </w:tr>
+      <w:tr>
         <w:tc>
           <w:tcPr>
-            <w:tcW w:type="dxa" w:w="1975"/>
+            <w:tcW w:type="dxa" w:w="1100"/>
             <w:tcBorders>
               <w:top w:val="single" w:color="555555" w:sz="6"/>
               <w:left w:val="single" w:color="555555" w:sz="6"/>
@@ -2618,7 +2565,102 @@
                 <w:sz w:val="28"/>
                 <w:szCs w:val="28"/>
               </w:rPr>
-              <w:t xml:space="preserve">7</w:t>
+              <w:t xml:space="preserve">5</w:t>
+            </w:r>
+          </w:p>
+        </w:tc>
+        <w:tc>
+          <w:tcPr>
+            <w:tcW w:type="dxa" w:w="7900"/>
+            <w:tcBorders>
+              <w:top w:val="single" w:color="555555" w:sz="6"/>
+              <w:left w:val="single" w:color="555555" w:sz="6"/>
+              <w:bottom w:val="single" w:color="555555" w:sz="6"/>
+              <w:right w:val="single" w:color="555555" w:sz="6"/>
+            </w:tcBorders>
+            <w:tcMar>
+              <w:top w:type="dxa" w:w="80"/>
+              <w:left w:type="dxa" w:w="120"/>
+              <w:bottom w:type="dxa" w:w="80"/>
+              <w:right w:type="dxa" w:w="120"/>
+            </w:tcMar>
+          </w:tcPr>
+          <w:p>
+            <w:pPr>
+              <w:jc w:val="center"/>
+            </w:pPr>
+            <w:r>
+              <w:rPr>
+                <w:b w:val="false"/>
+                <w:bCs w:val="false"/>
+                <w:sz w:val="28"/>
+                <w:szCs w:val="28"/>
+              </w:rPr>
+              <w:t xml:space="preserve">−4</w:t>
+            </w:r>
+          </w:p>
+        </w:tc>
+      </w:tr>
+      <w:tr>
+        <w:tc>
+          <w:tcPr>
+            <w:tcW w:type="dxa" w:w="1100"/>
+            <w:tcBorders>
+              <w:top w:val="single" w:color="555555" w:sz="6"/>
+              <w:left w:val="single" w:color="555555" w:sz="6"/>
+              <w:bottom w:val="single" w:color="555555" w:sz="6"/>
+              <w:right w:val="single" w:color="555555" w:sz="6"/>
+            </w:tcBorders>
+            <w:tcMar>
+              <w:top w:type="dxa" w:w="80"/>
+              <w:left w:type="dxa" w:w="120"/>
+              <w:bottom w:type="dxa" w:w="80"/>
+              <w:right w:type="dxa" w:w="120"/>
+            </w:tcMar>
+          </w:tcPr>
+          <w:p>
+            <w:pPr>
+              <w:jc w:val="center"/>
+            </w:pPr>
+            <w:r>
+              <w:rPr>
+                <w:b w:val="false"/>
+                <w:bCs w:val="false"/>
+                <w:sz w:val="28"/>
+                <w:szCs w:val="28"/>
+              </w:rPr>
+              <w:t xml:space="preserve">10</w:t>
+            </w:r>
+          </w:p>
+        </w:tc>
+        <w:tc>
+          <w:tcPr>
+            <w:tcW w:type="dxa" w:w="7900"/>
+            <w:tcBorders>
+              <w:top w:val="single" w:color="555555" w:sz="6"/>
+              <w:left w:val="single" w:color="555555" w:sz="6"/>
+              <w:bottom w:val="single" w:color="555555" w:sz="6"/>
+              <w:right w:val="single" w:color="555555" w:sz="6"/>
+            </w:tcBorders>
+            <w:tcMar>
+              <w:top w:type="dxa" w:w="80"/>
+              <w:left w:type="dxa" w:w="120"/>
+              <w:bottom w:type="dxa" w:w="80"/>
+              <w:right w:type="dxa" w:w="120"/>
+            </w:tcMar>
+          </w:tcPr>
+          <w:p>
+            <w:pPr>
+              <w:jc w:val="center"/>
+            </w:pPr>
+            <w:r>
+              <w:rPr>
+                <w:b w:val="false"/>
+                <w:bCs w:val="false"/>
+                <w:sz w:val="28"/>
+                <w:szCs w:val="28"/>
+              </w:rPr>
+              <w:t xml:space="preserve">−11</w:t>
             </w:r>
           </w:p>
         </w:tc>
@@ -2658,7 +2700,7 @@
           <w:i/>
           <w:iCs/>
         </w:rPr>
-        <w:t xml:space="preserve">3</w:t>
+        <w:t xml:space="preserve">−14</w:t>
       </w:r>
     </w:p>
     <w:p>
@@ -2678,7 +2720,7 @@
           <w:i/>
           <w:iCs/>
         </w:rPr>
-        <w:t xml:space="preserve">4/3</w:t>
+        <w:t xml:space="preserve">−5/7</w:t>
       </w:r>
     </w:p>
     <w:p>
@@ -2698,7 +2740,7 @@
           <w:i/>
           <w:iCs/>
         </w:rPr>
-        <w:t xml:space="preserve">3/2</w:t>
+        <w:t xml:space="preserve">7/5</w:t>
       </w:r>
     </w:p>
     <w:p>
@@ -2718,7 +2760,7 @@
           <w:i/>
           <w:iCs/>
         </w:rPr>
-        <w:t xml:space="preserve">3/4</w:t>
+        <w:t xml:space="preserve">−7/5</w:t>
       </w:r>
     </w:p>
     <w:p>
@@ -2742,7 +2784,7 @@
           <w:i/>
           <w:iCs/>
         </w:rPr>
-        <w:t xml:space="preserve">(−8,−8)</w:t>
+        <w:t xml:space="preserve">(−15,24)</w:t>
       </w:r>
       <w:r>
         <w:t xml:space="preserve"> to </w:t>
@@ -2752,7 +2794,7 @@
           <w:i/>
           <w:iCs/>
         </w:rPr>
-        <w:t xml:space="preserve">(−4,−5)</w:t>
+        <w:t xml:space="preserve">(−5,10)</w:t>
       </w:r>
       <w:r>
         <w:t xml:space="preserve">: </w:t>
@@ -2762,7 +2804,7 @@
           <w:i/>
           <w:iCs/>
         </w:rPr>
-        <w:t xml:space="preserve">(−5−(−8))/(−4−(−8))=3/4</w:t>
+        <w:t xml:space="preserve">(10−24)/(−5−(−15))=(−14)/10=−7/5</w:t>
       </w:r>
       <w:r>
         <w:t xml:space="preserve">. From </w:t>
@@ -2772,7 +2814,7 @@
           <w:i/>
           <w:iCs/>
         </w:rPr>
-        <w:t xml:space="preserve">(4,1)</w:t>
+        <w:t xml:space="preserve">(5,−4)</w:t>
       </w:r>
       <w:r>
         <w:t xml:space="preserve"> to </w:t>
@@ -2782,7 +2824,7 @@
           <w:i/>
           <w:iCs/>
         </w:rPr>
-        <w:t xml:space="preserve">(12,7)</w:t>
+        <w:t xml:space="preserve">(10,−11)</w:t>
       </w:r>
       <w:r>
         <w:t xml:space="preserve">: </w:t>
@@ -2792,10 +2834,30 @@
           <w:i/>
           <w:iCs/>
         </w:rPr>
-        <w:t xml:space="preserve">6/8=3/4</w:t>
-      </w:r>
-      <w:r>
-        <w:t xml:space="preserve"> again. 3 is the change in </w:t>
+        <w:t xml:space="preserve">(−7)/5</w:t>
+      </w:r>
+      <w:r>
+        <w:t xml:space="preserve"> again, even though that step in </w:t>
+      </w:r>
+      <w:r>
+        <w:rPr>
+          <w:i/>
+          <w:iCs/>
+        </w:rPr>
+        <w:t xml:space="preserve">x</w:t>
+      </w:r>
+      <w:r>
+        <w:t xml:space="preserve"> is 5, not 10. </w:t>
+      </w:r>
+      <w:r>
+        <w:rPr>
+          <w:i/>
+          <w:iCs/>
+        </w:rPr>
+        <w:t xml:space="preserve">−14</w:t>
+      </w:r>
+      <w:r>
+        <w:t xml:space="preserve"> is the change in </w:t>
       </w:r>
       <w:r>
         <w:rPr>
@@ -2815,14 +2877,14 @@
         <w:t xml:space="preserve">x</w:t>
       </w:r>
       <w:r>
-        <w:t xml:space="preserve">, which is 4; </w:t>
-      </w:r>
-      <w:r>
-        <w:rPr>
-          <w:i/>
-          <w:iCs/>
-        </w:rPr>
-        <w:t xml:space="preserve">4/3</w:t>
+        <w:t xml:space="preserve">; </w:t>
+      </w:r>
+      <w:r>
+        <w:rPr>
+          <w:i/>
+          <w:iCs/>
+        </w:rPr>
+        <w:t xml:space="preserve">−5/7</w:t>
       </w:r>
       <w:r>
         <w:t xml:space="preserve"> divides the other way; and </w:t>
@@ -2832,10 +2894,10 @@
           <w:i/>
           <w:iCs/>
         </w:rPr>
-        <w:t xml:space="preserve">3/2</w:t>
-      </w:r>
-      <w:r>
-        <w:t xml:space="preserve"> mixes rows, using the change in </w:t>
+        <w:t xml:space="preserve">7/5</w:t>
+      </w:r>
+      <w:r>
+        <w:t xml:space="preserve"> loses the sign, though </w:t>
       </w:r>
       <w:r>
         <w:rPr>
@@ -2845,7 +2907,7 @@
         <w:t xml:space="preserve">y</w:t>
       </w:r>
       <w:r>
-        <w:t xml:space="preserve"> from the second row to the third, 6, over the change in </w:t>
+        <w:t xml:space="preserve"> goes down as </w:t>
       </w:r>
       <w:r>
         <w:rPr>
@@ -2855,7 +2917,7 @@
         <w:t xml:space="preserve">x</w:t>
       </w:r>
       <w:r>
-        <w:t xml:space="preserve"> from the first row to the second, 4. </w:t>
+        <w:t xml:space="preserve"> goes up. </w:t>
       </w:r>
       <w:r>
         <w:rPr>
@@ -2871,7 +2933,7 @@
           <w:i/>
           <w:iCs/>
         </w:rPr>
-        <w:t xml:space="preserve">3/4</w:t>
+        <w:t xml:space="preserve">−7/5</w:t>
       </w:r>
       <w:r>
         <w:rPr>
@@ -2897,9 +2959,9 @@
       <w:r>
         <w:drawing>
           <wp:inline distT="0" distB="0" distL="0" distR="0">
-            <wp:extent cx="2552700" cy="2476500"/>
+            <wp:extent cx="2543175" cy="2476500"/>
             <wp:effectExtent t="0" r="0" b="0" l="0"/>
-            <wp:docPr id="1" name="gr1" descr="A straight line on a grid from −10 to 10. Plotted data: A straight line on a grid from −10 to 10 in both directions, with grid lines every 1 unit and no points marked. It rises from left to right, passing through (0, −3), (2, 1) and (5, 7)." title="A straight line on a grid from −10 to 10"/>
+            <wp:docPr id="1" name="gr1" descr="A straight line on a grid from −10 to 10. Plotted data: A straight line on a grid from −10 to 10 in both directions, with grid lines every 1 unit and no points marked. It falls steeply from left to right, passing through (−2, 6), (0, 1) and (4, −9)." title="A straight line on a grid from −10 to 10"/>
             <wp:cNvGraphicFramePr>
               <a:graphicFrameLocks xmlns:a="http://schemas.openxmlformats.org/drawingml/2006/main" noChangeAspect="1"/>
             </wp:cNvGraphicFramePr>
@@ -2922,7 +2984,7 @@
                   <pic:spPr bwMode="auto">
                     <a:xfrm>
                       <a:off x="0" y="0"/>
-                      <a:ext cx="2552700" cy="2476500"/>
+                      <a:ext cx="2543175" cy="2476500"/>
                     </a:xfrm>
                     <a:prstGeom prst="rect">
                       <a:avLst/>
@@ -2953,7 +3015,7 @@
           <w:sz w:val="22"/>
           <w:szCs w:val="22"/>
         </w:rPr>
-        <w:t xml:space="preserve">A straight line on a grid from −10 to 10 in both directions, with grid lines every 1 unit and no points marked. It rises from left to right, passing through (0, −3), (2, 1) and (5, 7).</w:t>
+        <w:t xml:space="preserve">A straight line on a grid from −10 to 10 in both directions, with grid lines every 1 unit and no points marked. It falls steeply from left to right, passing through (−2, 6), (0, 1) and (4, −9).</w:t>
       </w:r>
     </w:p>
     <w:p>
@@ -2990,7 +3052,7 @@
           <w:i/>
           <w:iCs/>
         </w:rPr>
-        <w:t xml:space="preserve">−2</w:t>
+        <w:t xml:space="preserve">5/2</w:t>
       </w:r>
     </w:p>
     <w:p>
@@ -3010,7 +3072,7 @@
           <w:i/>
           <w:iCs/>
         </w:rPr>
-        <w:t xml:space="preserve">2</w:t>
+        <w:t xml:space="preserve">−5/2</w:t>
       </w:r>
     </w:p>
     <w:p>
@@ -3030,7 +3092,7 @@
           <w:i/>
           <w:iCs/>
         </w:rPr>
-        <w:t xml:space="preserve">1/2</w:t>
+        <w:t xml:space="preserve">−2/5</w:t>
       </w:r>
     </w:p>
     <w:p>
@@ -3050,7 +3112,7 @@
           <w:i/>
           <w:iCs/>
         </w:rPr>
-        <w:t xml:space="preserve">−3</w:t>
+        <w:t xml:space="preserve">1</w:t>
       </w:r>
     </w:p>
     <w:p>
@@ -3067,44 +3129,44 @@
         <w:spacing w:after="120" w:before="80" w:line="300"/>
       </w:pPr>
       <w:r>
-        <w:t xml:space="preserve">The line crosses grid corners at </w:t>
-      </w:r>
-      <w:r>
-        <w:rPr>
-          <w:i/>
-          <w:iCs/>
-        </w:rPr>
-        <w:t xml:space="preserve">(0,−3)</w:t>
-      </w:r>
-      <w:r>
-        <w:t xml:space="preserve"> and </w:t>
-      </w:r>
-      <w:r>
-        <w:rPr>
-          <w:i/>
-          <w:iCs/>
-        </w:rPr>
-        <w:t xml:space="preserve">(2,1)</w:t>
-      </w:r>
-      <w:r>
-        <w:t xml:space="preserve">. From the first to the second, it goes up 4 and over 2: </w:t>
-      </w:r>
-      <w:r>
-        <w:rPr>
-          <w:i/>
-          <w:iCs/>
-        </w:rPr>
-        <w:t xml:space="preserve">4/2=2</w:t>
-      </w:r>
-      <w:r>
-        <w:t xml:space="preserve">. It rises from left to right, so the slope is positive, which rules out </w:t>
-      </w:r>
-      <w:r>
-        <w:rPr>
-          <w:i/>
-          <w:iCs/>
-        </w:rPr>
-        <w:t xml:space="preserve">−2</w:t>
+        <w:t xml:space="preserve">The line passes through </w:t>
+      </w:r>
+      <w:r>
+        <w:rPr>
+          <w:i/>
+          <w:iCs/>
+        </w:rPr>
+        <w:t xml:space="preserve">(0,1)</w:t>
+      </w:r>
+      <w:r>
+        <w:t xml:space="preserve">, but one step over it is not on a grid corner. The next corner is </w:t>
+      </w:r>
+      <w:r>
+        <w:rPr>
+          <w:i/>
+          <w:iCs/>
+        </w:rPr>
+        <w:t xml:space="preserve">(2,−4)</w:t>
+      </w:r>
+      <w:r>
+        <w:t xml:space="preserve">: over 2, down 5. So the slope is </w:t>
+      </w:r>
+      <w:r>
+        <w:rPr>
+          <w:i/>
+          <w:iCs/>
+        </w:rPr>
+        <w:t xml:space="preserve">(−5)/2=−5/2</w:t>
+      </w:r>
+      <w:r>
+        <w:t xml:space="preserve">. It falls from left to right, which rules out </w:t>
+      </w:r>
+      <w:r>
+        <w:rPr>
+          <w:i/>
+          <w:iCs/>
+        </w:rPr>
+        <w:t xml:space="preserve">5/2</w:t>
       </w:r>
       <w:r>
         <w:t xml:space="preserve">. </w:t>
@@ -3114,20 +3176,10 @@
           <w:i/>
           <w:iCs/>
         </w:rPr>
-        <w:t xml:space="preserve">1/2</w:t>
-      </w:r>
-      <w:r>
-        <w:t xml:space="preserve"> is run over rise; and </w:t>
-      </w:r>
-      <w:r>
-        <w:rPr>
-          <w:i/>
-          <w:iCs/>
-        </w:rPr>
-        <w:t xml:space="preserve">−3</w:t>
-      </w:r>
-      <w:r>
-        <w:t xml:space="preserve"> is where the line crosses the </w:t>
+        <w:t xml:space="preserve">−2/5</w:t>
+      </w:r>
+      <w:r>
+        <w:t xml:space="preserve"> is run over rise; and 1 is where the line crosses the </w:t>
       </w:r>
       <w:r>
         <w:rPr>
@@ -3144,7 +3196,23 @@
           <w:b/>
           <w:bCs/>
         </w:rPr>
-        <w:t xml:space="preserve">The slope is 2.</w:t>
+        <w:t xml:space="preserve">The slope is </w:t>
+      </w:r>
+      <w:r>
+        <w:rPr>
+          <w:b/>
+          <w:bCs/>
+          <w:i/>
+          <w:iCs/>
+        </w:rPr>
+        <w:t xml:space="preserve">−5/2</w:t>
+      </w:r>
+      <w:r>
+        <w:rPr>
+          <w:b/>
+          <w:bCs/>
+        </w:rPr>
+        <w:t xml:space="preserve">.</w:t>
       </w:r>
     </w:p>
     <w:p>
@@ -4009,7 +4077,7 @@
         <w:t xml:space="preserve">C.  </w:t>
       </w:r>
       <w:r>
-        <w:t xml:space="preserve">Slope is run over rise, so it should be −4/−8 = 1/2.</w:t>
+        <w:t xml:space="preserve">Slope is run over rise, so it should be 1/2.</w:t>
       </w:r>
     </w:p>
     <w:p>
@@ -4025,7 +4093,7 @@
         <w:t xml:space="preserve">D.  </w:t>
       </w:r>
       <w:r>
-        <w:t xml:space="preserve">Add the coordinates instead, so (5 − 3)/(2 + 6) = 1/4.</w:t>
+        <w:t xml:space="preserve">Add the coordinates instead, giving 2 over 8, or 1/4.</w:t>
       </w:r>
     </w:p>
     <w:p>
@@ -4092,7 +4160,27 @@
         <w:t xml:space="preserve">(6,−3)</w:t>
       </w:r>
       <w:r>
-        <w:t xml:space="preserve">, so its slope must be negative. Slope is rise over run, not run over rise; and slope subtracts coordinates, it never adds them. </w:t>
+        <w:t xml:space="preserve">, so its slope must be negative. Slope is rise over run, not run over rise, which would give </w:t>
+      </w:r>
+      <w:r>
+        <w:rPr>
+          <w:i/>
+          <w:iCs/>
+        </w:rPr>
+        <w:t xml:space="preserve">(−4)/(−8)=1/2</w:t>
+      </w:r>
+      <w:r>
+        <w:t xml:space="preserve">; and adding the coordinates, </w:t>
+      </w:r>
+      <w:r>
+        <w:rPr>
+          <w:i/>
+          <w:iCs/>
+        </w:rPr>
+        <w:t xml:space="preserve">(5+(−3))/(2+6)=2/8</w:t>
+      </w:r>
+      <w:r>
+        <w:t xml:space="preserve">, does not measure change at all. </w:t>
       </w:r>
       <w:r>
         <w:rPr>
@@ -4405,7 +4493,7 @@
         <w:t xml:space="preserve">D.  </w:t>
       </w:r>
       <w:r>
-        <w:t xml:space="preserve">It should be 1, since a line rises 1 for every 1 over.</w:t>
+        <w:t xml:space="preserve">It should be 4, the distance from the line to the x-axis.</w:t>
       </w:r>
     </w:p>
     <w:p>
@@ -4472,7 +4560,17 @@
         <w:t xml:space="preserve">−4</w:t>
       </w:r>
       <w:r>
-        <w:t xml:space="preserve"> is the line's height, not its slope; and not every line rises 1 for every 1. </w:t>
+        <w:t xml:space="preserve"> is the line's height, and 4 is its distance from the </w:t>
+      </w:r>
+      <w:r>
+        <w:rPr>
+          <w:i/>
+          <w:iCs/>
+        </w:rPr>
+        <w:t xml:space="preserve">x</w:t>
+      </w:r>
+      <w:r>
+        <w:t xml:space="preserve">-axis; neither is a slope. </w:t>
       </w:r>
       <w:r>
         <w:rPr>
@@ -5026,7 +5124,7 @@
           <w:sz w:val="40"/>
           <w:szCs w:val="40"/>
         </w:rPr>
-        <w:t xml:space="preserve">f(x)=√x  on  [4,9]:    (√9−√4)/(9−4)=√5/5</w:t>
+        <w:t xml:space="preserve">f(x)=√x  on  [4,9]:    (√9−√4)/(9−4)=(√5)/5</w:t>
       </w:r>
     </w:p>
     <w:p>
@@ -5091,7 +5189,7 @@
         <w:t xml:space="preserve">C.  </w:t>
       </w:r>
       <w:r>
-        <w:t xml:space="preserve">Divide by √5 instead, giving √5/√5 = 1.</w:t>
+        <w:t xml:space="preserve">Divide by √5 instead, which gives 1.</w:t>
       </w:r>
     </w:p>
     <w:p>
@@ -5107,7 +5205,7 @@
         <w:t xml:space="preserve">D.  </w:t>
       </w:r>
       <w:r>
-        <w:t xml:space="preserve">The interval length is 9, so it should be √5/9.</w:t>
+        <w:t xml:space="preserve">The interval length is 9, so divide √5 by 9.</w:t>
       </w:r>
     </w:p>
     <w:p>

</xml_diff>